<commit_message>
Added Uniswap, opensource projects and updated StopMercuryAttacks
</commit_message>
<xml_diff>
--- a/Chee-Wee Chua's Portfolio of Projects.docx
+++ b/Chee-Wee Chua's Portfolio of Projects.docx
@@ -19,254 +19,27 @@
         <w:rPr>
           <w:rStyle w:val="Heading1Char"/>
         </w:rPr>
-        <w:t>Uniswap Hook Donations</w:t>
-      </w:r>
-    </w:p>
-    <w:p>
-      <w:pPr>
-        <w:rPr>
-          <w:lang w:val="en-US"/>
-        </w:rPr>
-      </w:pPr>
-      <w:r>
-        <w:rPr>
-          <w:lang w:val="en-US"/>
-        </w:rPr>
-        <w:t>A smart contract and a web browser interface that works underneath Uniswap, to allow donations to specific addresses.</w:t>
-      </w:r>
-    </w:p>
-    <w:p>
-      <w:pPr>
-        <w:rPr>
-          <w:lang w:val="en-US"/>
-        </w:rPr>
-      </w:pPr>
-      <w:r>
-        <w:rPr>
-          <w:lang w:val="en-US"/>
-        </w:rPr>
-        <w:t xml:space="preserve">Skills: </w:t>
-      </w:r>
-      <w:r>
-        <w:rPr>
-          <w:lang w:val="en-US"/>
-        </w:rPr>
-        <w:t>TypeScript, Web3, Solidity, Node.js, DeFi</w:t>
-      </w:r>
-    </w:p>
-    <w:p>
-      <w:pPr>
-        <w:rPr>
-          <w:lang w:val="en-US"/>
-        </w:rPr>
-      </w:pPr>
-      <w:r>
-        <w:rPr>
-          <w:rStyle w:val="Heading1Char"/>
-        </w:rPr>
-        <w:t>Application</w:t>
-      </w:r>
-      <w:r>
-        <w:rPr>
-          <w:rStyle w:val="Heading1Char"/>
-        </w:rPr>
-        <w:t xml:space="preserve"> Debugger / Monitor</w:t>
-      </w:r>
-      <w:r>
-        <w:rPr>
-          <w:rStyle w:val="Heading1Char"/>
-        </w:rPr>
-        <w:br/>
-      </w:r>
-      <w:r>
-        <w:rPr>
-          <w:lang w:val="en-US"/>
-        </w:rPr>
-        <w:t xml:space="preserve">Launches specified Windows application and monitors its </w:t>
-      </w:r>
-      <w:r>
-        <w:rPr>
-          <w:lang w:val="en-US"/>
-        </w:rPr>
-        <w:t xml:space="preserve">debug messages, loading and unloading of libraries, </w:t>
-      </w:r>
-      <w:r>
-        <w:rPr>
-          <w:lang w:val="en-US"/>
-        </w:rPr>
-        <w:t xml:space="preserve">thread starts and exits, </w:t>
-      </w:r>
-      <w:r>
-        <w:rPr>
-          <w:lang w:val="en-US"/>
-        </w:rPr>
-        <w:t>exceptions</w:t>
-      </w:r>
-      <w:r>
-        <w:rPr>
-          <w:lang w:val="en-US"/>
-        </w:rPr>
-        <w:t xml:space="preserve">, and </w:t>
-      </w:r>
-      <w:r>
-        <w:rPr>
-          <w:lang w:val="en-US"/>
-        </w:rPr>
-        <w:t>breakpoints.</w:t>
-      </w:r>
-    </w:p>
-    <w:p>
-      <w:pPr>
-        <w:rPr>
-          <w:lang w:val="en-US"/>
-        </w:rPr>
-      </w:pPr>
-      <w:r>
-        <w:rPr>
-          <w:lang w:val="en-US"/>
-        </w:rPr>
-        <w:t>Skills: Win32 API, Debugger</w:t>
-      </w:r>
-    </w:p>
-    <w:p>
-      <w:pPr>
-        <w:rPr>
-          <w:lang w:val="en-US"/>
-        </w:rPr>
-      </w:pPr>
-      <w:r>
-        <w:rPr>
-          <w:rStyle w:val="Heading1Char"/>
-        </w:rPr>
-        <w:t>Blockchain t</w:t>
-      </w:r>
-      <w:r>
-        <w:rPr>
-          <w:rStyle w:val="Heading1Char"/>
-        </w:rPr>
-        <w:t>ransaction scanner</w:t>
-      </w:r>
-      <w:r>
-        <w:rPr>
-          <w:lang w:val="en-US"/>
-        </w:rPr>
-        <w:br/>
-        <w:t xml:space="preserve">Scans </w:t>
-      </w:r>
-      <w:r>
-        <w:rPr>
-          <w:lang w:val="en-US"/>
-        </w:rPr>
-        <w:t xml:space="preserve">and tracks </w:t>
-      </w:r>
-      <w:r>
-        <w:rPr>
-          <w:lang w:val="en-US"/>
-        </w:rPr>
-        <w:t xml:space="preserve">transactions on Solana, </w:t>
-      </w:r>
-      <w:proofErr w:type="spellStart"/>
-      <w:r>
-        <w:rPr>
-          <w:lang w:val="en-US"/>
-        </w:rPr>
-        <w:t>Polkadot</w:t>
-      </w:r>
-      <w:proofErr w:type="spellEnd"/>
-      <w:r>
-        <w:rPr>
-          <w:lang w:val="en-US"/>
-        </w:rPr>
-        <w:t xml:space="preserve">, </w:t>
-      </w:r>
-      <w:r>
-        <w:rPr>
-          <w:lang w:val="en-US"/>
-        </w:rPr>
-        <w:t>Polygon, Ethereum on Node.js</w:t>
-      </w:r>
-      <w:r>
-        <w:rPr>
-          <w:lang w:val="en-US"/>
-        </w:rPr>
-        <w:t xml:space="preserve"> and encapsulated in a wallet application.</w:t>
-      </w:r>
-    </w:p>
-    <w:p>
-      <w:pPr>
-        <w:rPr>
-          <w:lang w:val="en-US"/>
-        </w:rPr>
-      </w:pPr>
-      <w:r>
-        <w:rPr>
-          <w:lang w:val="en-US"/>
-        </w:rPr>
-        <w:t>Skills: Node.js, TypeScript, Web</w:t>
-      </w:r>
-      <w:r>
-        <w:rPr>
-          <w:lang w:val="en-US"/>
-        </w:rPr>
-        <w:t>3</w:t>
-      </w:r>
-    </w:p>
-    <w:p>
-      <w:pPr>
-        <w:rPr>
-          <w:lang w:val="en-SG"/>
-        </w:rPr>
-      </w:pPr>
-      <w:r>
-        <w:rPr>
-          <w:rStyle w:val="Heading1Char"/>
-        </w:rPr>
-        <w:t>Open source Node</w:t>
-      </w:r>
-      <w:r>
-        <w:rPr>
-          <w:rStyle w:val="Heading1Char"/>
-        </w:rPr>
-        <w:t>.</w:t>
-      </w:r>
-      <w:r>
-        <w:rPr>
-          <w:rStyle w:val="Heading1Char"/>
-        </w:rPr>
-        <w:t xml:space="preserve">js library - </w:t>
-      </w:r>
-      <w:proofErr w:type="spellStart"/>
-      <w:r>
-        <w:rPr>
-          <w:rStyle w:val="Heading1Char"/>
-        </w:rPr>
-        <w:t>DelphiRTL</w:t>
-      </w:r>
-      <w:proofErr w:type="spellEnd"/>
-      <w:r>
-        <w:rPr>
-          <w:lang w:val="en-US"/>
-        </w:rPr>
-        <w:t xml:space="preserve"> </w:t>
-      </w:r>
-      <w:r>
-        <w:rPr>
-          <w:lang w:val="en-US"/>
-        </w:rPr>
-        <w:br/>
-      </w:r>
-      <w:r>
-        <w:rPr>
-          <w:lang w:val="en-SG"/>
-        </w:rPr>
-        <w:t xml:space="preserve">A library of routines that provides common functionality, such as JSON RPC, logging, date routines for use on Node.js on </w:t>
+        <w:t>Open source Node.js library - web3-wallet-utils</w:t>
+      </w:r>
+    </w:p>
+    <w:p>
+      <w:pPr>
+        <w:rPr>
+          <w:lang w:val="en-US"/>
+        </w:rPr>
+      </w:pPr>
+      <w:r>
+        <w:rPr>
+          <w:lang w:val="en-US"/>
+        </w:rPr>
+        <w:t xml:space="preserve">A library of routines that provides blockchain-related utilities, available on  </w:t>
       </w:r>
       <w:hyperlink r:id="rId8" w:history="1">
         <w:proofErr w:type="spellStart"/>
         <w:r>
           <w:rPr>
             <w:rStyle w:val="Hyperlink"/>
-            <w:lang w:val="en-SG"/>
+            <w:lang w:val="en-US"/>
           </w:rPr>
           <w:t>npm</w:t>
         </w:r>
@@ -274,14 +47,14 @@
         <w:r>
           <w:rPr>
             <w:rStyle w:val="Hyperlink"/>
-            <w:lang w:val="en-SG"/>
+            <w:lang w:val="en-US"/>
           </w:rPr>
           <w:t xml:space="preserve"> registry</w:t>
         </w:r>
       </w:hyperlink>
       <w:r>
         <w:rPr>
-          <w:lang w:val="en-SG"/>
+          <w:lang w:val="en-US"/>
         </w:rPr>
         <w:t>.</w:t>
       </w:r>
@@ -296,7 +69,329 @@
         <w:rPr>
           <w:lang w:val="en-US"/>
         </w:rPr>
-        <w:t>Skills: Node.js, TypeScript</w:t>
+        <w:t>Skills: TypeScript, Web3, Node.js</w:t>
+      </w:r>
+    </w:p>
+    <w:p>
+      <w:pPr>
+        <w:rPr>
+          <w:rStyle w:val="Heading1Char"/>
+        </w:rPr>
+      </w:pPr>
+      <w:proofErr w:type="gramStart"/>
+      <w:r>
+        <w:rPr>
+          <w:rStyle w:val="Heading1Char"/>
+        </w:rPr>
+        <w:t>Open source</w:t>
+      </w:r>
+      <w:proofErr w:type="gramEnd"/>
+      <w:r>
+        <w:rPr>
+          <w:rStyle w:val="Heading1Char"/>
+        </w:rPr>
+        <w:t xml:space="preserve"> Ronin </w:t>
+      </w:r>
+      <w:proofErr w:type="spellStart"/>
+      <w:r>
+        <w:rPr>
+          <w:rStyle w:val="Heading1Char"/>
+        </w:rPr>
+        <w:t>SkyNet</w:t>
+      </w:r>
+      <w:proofErr w:type="spellEnd"/>
+      <w:r>
+        <w:rPr>
+          <w:rStyle w:val="Heading1Char"/>
+        </w:rPr>
+        <w:t xml:space="preserve"> Web3 and JSON RPC provider</w:t>
+      </w:r>
+      <w:r>
+        <w:rPr>
+          <w:rStyle w:val="Heading1Char"/>
+        </w:rPr>
+        <w:t>s</w:t>
+      </w:r>
+    </w:p>
+    <w:p>
+      <w:pPr>
+        <w:rPr>
+          <w:lang w:val="en-US"/>
+        </w:rPr>
+      </w:pPr>
+      <w:r>
+        <w:rPr>
+          <w:lang w:val="en-US"/>
+        </w:rPr>
+        <w:t>A library consisting of a JSON RPC and Skynet Web3 provider for Ronin.</w:t>
+      </w:r>
+    </w:p>
+    <w:p>
+      <w:pPr>
+        <w:rPr>
+          <w:lang w:val="en-US"/>
+        </w:rPr>
+      </w:pPr>
+      <w:r>
+        <w:rPr>
+          <w:lang w:val="en-US"/>
+        </w:rPr>
+        <w:t>Skills: TypeScript, Web3, Node.js</w:t>
+      </w:r>
+    </w:p>
+    <w:p>
+      <w:pPr>
+        <w:rPr>
+          <w:rStyle w:val="Heading1Char"/>
+        </w:rPr>
+      </w:pPr>
+      <w:r>
+        <w:rPr>
+          <w:rStyle w:val="Heading1Char"/>
+        </w:rPr>
+        <w:t>Uniswap Hook Donations</w:t>
+      </w:r>
+    </w:p>
+    <w:p>
+      <w:pPr>
+        <w:rPr>
+          <w:lang w:val="en-US"/>
+        </w:rPr>
+      </w:pPr>
+      <w:r>
+        <w:rPr>
+          <w:lang w:val="en-US"/>
+        </w:rPr>
+        <w:t>A smart contract and a web browser interface that works underneath Uniswap, to allow donations to specific addresses</w:t>
+      </w:r>
+      <w:r>
+        <w:rPr>
+          <w:lang w:val="en-US"/>
+        </w:rPr>
+        <w:t xml:space="preserve"> when using Uniswap</w:t>
+      </w:r>
+      <w:r>
+        <w:rPr>
+          <w:lang w:val="en-US"/>
+        </w:rPr>
+        <w:t>.</w:t>
+      </w:r>
+    </w:p>
+    <w:p>
+      <w:pPr>
+        <w:rPr>
+          <w:lang w:val="en-US"/>
+        </w:rPr>
+      </w:pPr>
+      <w:r>
+        <w:rPr>
+          <w:lang w:val="en-US"/>
+        </w:rPr>
+        <w:t>Skills: TypeScript, Web3, Solidity, Node.js, DeFi</w:t>
+      </w:r>
+    </w:p>
+    <w:p>
+      <w:pPr>
+        <w:rPr>
+          <w:lang w:val="en-US"/>
+        </w:rPr>
+      </w:pPr>
+      <w:r>
+        <w:rPr>
+          <w:rStyle w:val="Heading1Char"/>
+        </w:rPr>
+        <w:t>Application</w:t>
+      </w:r>
+      <w:r>
+        <w:rPr>
+          <w:rStyle w:val="Heading1Char"/>
+        </w:rPr>
+        <w:t xml:space="preserve"> Debugger / Monitor</w:t>
+      </w:r>
+      <w:r>
+        <w:rPr>
+          <w:rStyle w:val="Heading1Char"/>
+        </w:rPr>
+        <w:br/>
+      </w:r>
+      <w:r>
+        <w:rPr>
+          <w:lang w:val="en-US"/>
+        </w:rPr>
+        <w:t xml:space="preserve">Launches specified Windows application and monitors its </w:t>
+      </w:r>
+      <w:r>
+        <w:rPr>
+          <w:lang w:val="en-US"/>
+        </w:rPr>
+        <w:t xml:space="preserve">debug messages, loading and unloading of libraries, </w:t>
+      </w:r>
+      <w:r>
+        <w:rPr>
+          <w:lang w:val="en-US"/>
+        </w:rPr>
+        <w:t xml:space="preserve">thread starts and exits, </w:t>
+      </w:r>
+      <w:r>
+        <w:rPr>
+          <w:lang w:val="en-US"/>
+        </w:rPr>
+        <w:t>exceptions</w:t>
+      </w:r>
+      <w:r>
+        <w:rPr>
+          <w:lang w:val="en-US"/>
+        </w:rPr>
+        <w:t xml:space="preserve">, and </w:t>
+      </w:r>
+      <w:r>
+        <w:rPr>
+          <w:lang w:val="en-US"/>
+        </w:rPr>
+        <w:t>breakpoints.</w:t>
+      </w:r>
+    </w:p>
+    <w:p>
+      <w:pPr>
+        <w:rPr>
+          <w:lang w:val="en-US"/>
+        </w:rPr>
+      </w:pPr>
+      <w:r>
+        <w:rPr>
+          <w:lang w:val="en-US"/>
+        </w:rPr>
+        <w:t>Skills: Win32 API, Debugger</w:t>
+      </w:r>
+    </w:p>
+    <w:p>
+      <w:pPr>
+        <w:rPr>
+          <w:rStyle w:val="Heading1Char"/>
+        </w:rPr>
+      </w:pPr>
+      <w:proofErr w:type="spellStart"/>
+      <w:r>
+        <w:rPr>
+          <w:rStyle w:val="Heading1Char"/>
+        </w:rPr>
+        <w:t>Adspeedup</w:t>
+      </w:r>
+      <w:proofErr w:type="spellEnd"/>
+      <w:r>
+        <w:rPr>
+          <w:rStyle w:val="Heading1Char"/>
+        </w:rPr>
+        <w:t xml:space="preserve"> Extension</w:t>
+      </w:r>
+    </w:p>
+    <w:p>
+      <w:pPr>
+        <w:rPr>
+          <w:lang w:val="en-US"/>
+        </w:rPr>
+      </w:pPr>
+      <w:r>
+        <w:rPr>
+          <w:lang w:val="en-US"/>
+        </w:rPr>
+        <w:t>A web browser extension that speeds up videos fulfilling certain criteria.</w:t>
+      </w:r>
+    </w:p>
+    <w:p>
+      <w:pPr>
+        <w:rPr>
+          <w:lang w:val="en-US"/>
+        </w:rPr>
+      </w:pPr>
+      <w:r>
+        <w:rPr>
+          <w:lang w:val="en-US"/>
+        </w:rPr>
+        <w:t>Skills: TypeScript, Manifest v2, Browser Extension</w:t>
+      </w:r>
+    </w:p>
+    <w:p>
+      <w:pPr>
+        <w:rPr>
+          <w:lang w:val="en-US"/>
+        </w:rPr>
+      </w:pPr>
+      <w:r>
+        <w:rPr>
+          <w:rStyle w:val="Heading1Char"/>
+        </w:rPr>
+        <w:t>Blockchain t</w:t>
+      </w:r>
+      <w:r>
+        <w:rPr>
+          <w:rStyle w:val="Heading1Char"/>
+        </w:rPr>
+        <w:t>ransaction scanner</w:t>
+      </w:r>
+      <w:r>
+        <w:rPr>
+          <w:lang w:val="en-US"/>
+        </w:rPr>
+        <w:br/>
+        <w:t xml:space="preserve">Scans </w:t>
+      </w:r>
+      <w:r>
+        <w:rPr>
+          <w:lang w:val="en-US"/>
+        </w:rPr>
+        <w:t xml:space="preserve">and tracks </w:t>
+      </w:r>
+      <w:r>
+        <w:rPr>
+          <w:lang w:val="en-US"/>
+        </w:rPr>
+        <w:t xml:space="preserve">transactions on Solana, </w:t>
+      </w:r>
+      <w:proofErr w:type="spellStart"/>
+      <w:r>
+        <w:rPr>
+          <w:lang w:val="en-US"/>
+        </w:rPr>
+        <w:t>Polkadot</w:t>
+      </w:r>
+      <w:proofErr w:type="spellEnd"/>
+      <w:r>
+        <w:rPr>
+          <w:lang w:val="en-US"/>
+        </w:rPr>
+        <w:t xml:space="preserve">, </w:t>
+      </w:r>
+      <w:r>
+        <w:rPr>
+          <w:lang w:val="en-US"/>
+        </w:rPr>
+        <w:t>Polygon, Ethereum on Node.js</w:t>
+      </w:r>
+      <w:r>
+        <w:rPr>
+          <w:lang w:val="en-US"/>
+        </w:rPr>
+        <w:t xml:space="preserve"> and encapsulated in a wallet application.</w:t>
+      </w:r>
+    </w:p>
+    <w:p>
+      <w:pPr>
+        <w:rPr>
+          <w:lang w:val="en-US"/>
+        </w:rPr>
+      </w:pPr>
+      <w:r>
+        <w:rPr>
+          <w:lang w:val="en-US"/>
+        </w:rPr>
+        <w:t>Skills: Node.js, TypeScript, Web</w:t>
+      </w:r>
+      <w:r>
+        <w:rPr>
+          <w:lang w:val="en-US"/>
+        </w:rPr>
+        <w:t>3</w:t>
       </w:r>
     </w:p>
     <w:p>
@@ -321,34 +416,24 @@
         <w:rPr>
           <w:rStyle w:val="Heading1Char"/>
         </w:rPr>
-        <w:t xml:space="preserve">js library </w:t>
-      </w:r>
-      <w:r>
-        <w:rPr>
-          <w:rStyle w:val="Heading1Char"/>
-        </w:rPr>
-        <w:t>–</w:t>
-      </w:r>
-      <w:r>
-        <w:rPr>
-          <w:rStyle w:val="Heading1Char"/>
+        <w:t xml:space="preserve">js library - </w:t>
+      </w:r>
+      <w:proofErr w:type="spellStart"/>
+      <w:r>
+        <w:rPr>
+          <w:rStyle w:val="Heading1Char"/>
+        </w:rPr>
+        <w:t>DelphiRTL</w:t>
+      </w:r>
+      <w:proofErr w:type="spellEnd"/>
+      <w:r>
+        <w:rPr>
+          <w:lang w:val="en-US"/>
         </w:rPr>
         <w:t xml:space="preserve"> </w:t>
       </w:r>
       <w:r>
         <w:rPr>
-          <w:rStyle w:val="Heading1Char"/>
-        </w:rPr>
-        <w:t>web3-wallet-api</w:t>
-      </w:r>
-      <w:r>
-        <w:rPr>
-          <w:lang w:val="en-US"/>
-        </w:rPr>
-        <w:t xml:space="preserve"> </w:t>
-      </w:r>
-      <w:r>
-        <w:rPr>
           <w:lang w:val="en-US"/>
         </w:rPr>
         <w:br/>
@@ -357,7 +442,7 @@
         <w:rPr>
           <w:lang w:val="en-SG"/>
         </w:rPr>
-        <w:t xml:space="preserve">A library of routines that provides common Web3 wallets functionality for web browsers, available on </w:t>
+        <w:t xml:space="preserve">A library of routines that provides common functionality, such as JSON RPC, logging, date routines for use on Node.js on </w:t>
       </w:r>
       <w:hyperlink r:id="rId9" w:history="1">
         <w:proofErr w:type="spellStart"/>
@@ -400,14 +485,103 @@
     <w:p>
       <w:pPr>
         <w:rPr>
-          <w:rFonts w:asciiTheme="majorHAnsi" w:eastAsiaTheme="majorEastAsia" w:hAnsiTheme="majorHAnsi" w:cstheme="majorBidi"/>
-          <w:color w:val="2F5496" w:themeColor="accent1" w:themeShade="BF"/>
-          <w:sz w:val="32"/>
-          <w:szCs w:val="32"/>
-          <w:lang w:val="en-SG"/>
-        </w:rPr>
-      </w:pPr>
-      <w:r>
+          <w:lang w:val="en-SG"/>
+        </w:rPr>
+      </w:pPr>
+      <w:r>
+        <w:rPr>
+          <w:rStyle w:val="Heading1Char"/>
+        </w:rPr>
+        <w:t>Open source Node</w:t>
+      </w:r>
+      <w:r>
+        <w:rPr>
+          <w:rStyle w:val="Heading1Char"/>
+        </w:rPr>
+        <w:t>.</w:t>
+      </w:r>
+      <w:r>
+        <w:rPr>
+          <w:rStyle w:val="Heading1Char"/>
+        </w:rPr>
+        <w:t xml:space="preserve">js library </w:t>
+      </w:r>
+      <w:r>
+        <w:rPr>
+          <w:rStyle w:val="Heading1Char"/>
+        </w:rPr>
+        <w:t>–</w:t>
+      </w:r>
+      <w:r>
+        <w:rPr>
+          <w:rStyle w:val="Heading1Char"/>
+        </w:rPr>
+        <w:t xml:space="preserve"> </w:t>
+      </w:r>
+      <w:r>
+        <w:rPr>
+          <w:rStyle w:val="Heading1Char"/>
+        </w:rPr>
+        <w:t>web3-wallet-api</w:t>
+      </w:r>
+      <w:r>
+        <w:rPr>
+          <w:lang w:val="en-US"/>
+        </w:rPr>
+        <w:t xml:space="preserve"> </w:t>
+      </w:r>
+      <w:r>
+        <w:rPr>
+          <w:lang w:val="en-US"/>
+        </w:rPr>
+        <w:br/>
+      </w:r>
+      <w:r>
+        <w:rPr>
+          <w:lang w:val="en-SG"/>
+        </w:rPr>
+        <w:t xml:space="preserve">A library of routines that provides common Web3 wallets functionality for web browsers, available on </w:t>
+      </w:r>
+      <w:hyperlink r:id="rId10" w:history="1">
+        <w:proofErr w:type="spellStart"/>
+        <w:r>
+          <w:rPr>
+            <w:rStyle w:val="Hyperlink"/>
+            <w:lang w:val="en-SG"/>
+          </w:rPr>
+          <w:t>npm</w:t>
+        </w:r>
+        <w:proofErr w:type="spellEnd"/>
+        <w:r>
+          <w:rPr>
+            <w:rStyle w:val="Hyperlink"/>
+            <w:lang w:val="en-SG"/>
+          </w:rPr>
+          <w:t xml:space="preserve"> registry</w:t>
+        </w:r>
+      </w:hyperlink>
+      <w:r>
+        <w:rPr>
+          <w:lang w:val="en-SG"/>
+        </w:rPr>
+        <w:t>.</w:t>
+      </w:r>
+    </w:p>
+    <w:p>
+      <w:pPr>
+        <w:rPr>
+          <w:lang w:val="en-US"/>
+        </w:rPr>
+      </w:pPr>
+      <w:r>
+        <w:rPr>
+          <w:lang w:val="en-US"/>
+        </w:rPr>
+        <w:t>Skills: Node.js, TypeScript</w:t>
+      </w:r>
+    </w:p>
+    <w:p>
+      <w:pPr>
         <w:rPr>
           <w:rFonts w:asciiTheme="majorHAnsi" w:eastAsiaTheme="majorEastAsia" w:hAnsiTheme="majorHAnsi" w:cstheme="majorBidi"/>
           <w:b/>
@@ -417,6 +591,41 @@
           <w:szCs w:val="32"/>
           <w:lang w:val="en-SG"/>
         </w:rPr>
+      </w:pPr>
+      <w:r>
+        <w:rPr>
+          <w:rFonts w:asciiTheme="majorHAnsi" w:eastAsiaTheme="majorEastAsia" w:hAnsiTheme="majorHAnsi" w:cstheme="majorBidi"/>
+          <w:b/>
+          <w:bCs/>
+          <w:color w:val="2F5496" w:themeColor="accent1" w:themeShade="BF"/>
+          <w:sz w:val="32"/>
+          <w:szCs w:val="32"/>
+          <w:lang w:val="en-SG"/>
+        </w:rPr>
+        <w:br w:type="page"/>
+      </w:r>
+    </w:p>
+    <w:p>
+      <w:pPr>
+        <w:rPr>
+          <w:rFonts w:asciiTheme="majorHAnsi" w:eastAsiaTheme="majorEastAsia" w:hAnsiTheme="majorHAnsi" w:cstheme="majorBidi"/>
+          <w:color w:val="2F5496" w:themeColor="accent1" w:themeShade="BF"/>
+          <w:sz w:val="32"/>
+          <w:szCs w:val="32"/>
+          <w:lang w:val="en-SG"/>
+        </w:rPr>
+      </w:pPr>
+      <w:r>
+        <w:rPr>
+          <w:rFonts w:asciiTheme="majorHAnsi" w:eastAsiaTheme="majorEastAsia" w:hAnsiTheme="majorHAnsi" w:cstheme="majorBidi"/>
+          <w:b/>
+          <w:bCs/>
+          <w:color w:val="2F5496" w:themeColor="accent1" w:themeShade="BF"/>
+          <w:sz w:val="32"/>
+          <w:szCs w:val="32"/>
+          <w:lang w:val="en-SG"/>
+        </w:rPr>
+        <w:lastRenderedPageBreak/>
         <w:t>White Label Cryptocurrency Exchange</w:t>
       </w:r>
     </w:p>
@@ -592,7 +801,6 @@
         <w:rPr>
           <w:lang w:val="en-US"/>
         </w:rPr>
-        <w:lastRenderedPageBreak/>
         <w:t xml:space="preserve">Skills: </w:t>
       </w:r>
       <w:proofErr w:type="spellStart"/>
@@ -845,60 +1053,60 @@
         <w:rPr>
           <w:rStyle w:val="Heading1Char"/>
         </w:rPr>
+        <w:t>Terraform Filesystem Provider</w:t>
+      </w:r>
+    </w:p>
+    <w:p>
+      <w:pPr>
+        <w:rPr>
+          <w:lang w:val="en-US"/>
+        </w:rPr>
+      </w:pPr>
+      <w:r>
+        <w:rPr>
+          <w:lang w:val="en-US"/>
+        </w:rPr>
+        <w:t>A Terraform file system provider that manages directory and files.</w:t>
+      </w:r>
+    </w:p>
+    <w:p>
+      <w:pPr>
+        <w:rPr>
+          <w:rStyle w:val="Heading1Char"/>
+        </w:rPr>
+      </w:pPr>
+      <w:r>
+        <w:rPr>
+          <w:lang w:val="en-US"/>
+        </w:rPr>
+        <w:t>Skills: Go(lang), plugin, filesystem</w:t>
+      </w:r>
+    </w:p>
+    <w:p>
+      <w:pPr>
+        <w:rPr>
+          <w:rStyle w:val="Heading1Char"/>
+        </w:rPr>
+      </w:pPr>
+      <w:r>
+        <w:rPr>
+          <w:rStyle w:val="Heading1Char"/>
+        </w:rPr>
         <w:br w:type="page"/>
       </w:r>
     </w:p>
     <w:p>
       <w:pPr>
         <w:rPr>
-          <w:rStyle w:val="Heading1Char"/>
-        </w:rPr>
-      </w:pPr>
+          <w:lang w:val="en-US"/>
+        </w:rPr>
+      </w:pPr>
+      <w:proofErr w:type="spellStart"/>
       <w:r>
         <w:rPr>
           <w:rStyle w:val="Heading1Char"/>
         </w:rPr>
         <w:lastRenderedPageBreak/>
-        <w:t>Terraform Filesystem Provider</w:t>
-      </w:r>
-    </w:p>
-    <w:p>
-      <w:pPr>
-        <w:rPr>
-          <w:lang w:val="en-US"/>
-        </w:rPr>
-      </w:pPr>
-      <w:r>
-        <w:rPr>
-          <w:lang w:val="en-US"/>
-        </w:rPr>
-        <w:t>A Terraform file system provider that manages directory and files.</w:t>
-      </w:r>
-    </w:p>
-    <w:p>
-      <w:pPr>
-        <w:rPr>
-          <w:rStyle w:val="Heading1Char"/>
-        </w:rPr>
-      </w:pPr>
-      <w:r>
-        <w:rPr>
-          <w:lang w:val="en-US"/>
-        </w:rPr>
-        <w:t>Skills: Go(lang), plugin, filesystem</w:t>
-      </w:r>
-    </w:p>
-    <w:p>
-      <w:pPr>
-        <w:rPr>
-          <w:lang w:val="en-US"/>
-        </w:rPr>
-      </w:pPr>
-      <w:proofErr w:type="spellStart"/>
-      <w:r>
-        <w:rPr>
-          <w:rStyle w:val="Heading1Char"/>
-        </w:rPr>
         <w:t>StopMercuryAttacks</w:t>
       </w:r>
       <w:proofErr w:type="spellEnd"/>
@@ -915,7 +1123,7 @@
         </w:rPr>
         <w:t xml:space="preserve">External plugins to the </w:t>
       </w:r>
-      <w:hyperlink r:id="rId10" w:history="1">
+      <w:hyperlink r:id="rId11" w:history="1">
         <w:r>
           <w:rPr>
             <w:rStyle w:val="Hyperlink"/>
@@ -1142,20 +1350,38 @@
         <w:rPr>
           <w:lang w:val="en-SG"/>
         </w:rPr>
-        <w:t>IPv6 mapping, so that connections via IPv6 are possible.</w:t>
-      </w:r>
-    </w:p>
-    <w:p>
-      <w:pPr>
-        <w:rPr>
-          <w:lang w:val="en-SG"/>
-        </w:rPr>
-      </w:pPr>
-      <w:r>
-        <w:rPr>
-          <w:lang w:val="en-SG"/>
-        </w:rPr>
-        <w:t>Skills: Win32 API, DLL integration</w:t>
+        <w:t>IPv6 mapping, so that connections via IPv6 are possible</w:t>
+      </w:r>
+      <w:r>
+        <w:rPr>
+          <w:lang w:val="en-SG"/>
+        </w:rPr>
+        <w:t xml:space="preserve"> into an IPv4-only application.</w:t>
+      </w:r>
+    </w:p>
+    <w:p>
+      <w:pPr>
+        <w:rPr>
+          <w:lang w:val="en-SG"/>
+        </w:rPr>
+      </w:pPr>
+      <w:r>
+        <w:rPr>
+          <w:lang w:val="en-SG"/>
+        </w:rPr>
+        <w:t xml:space="preserve">Skills: Win32 API, </w:t>
+      </w:r>
+      <w:r>
+        <w:rPr>
+          <w:lang w:val="en-SG"/>
+        </w:rPr>
+        <w:t xml:space="preserve">cross-language </w:t>
+      </w:r>
+      <w:r>
+        <w:rPr>
+          <w:lang w:val="en-SG"/>
+        </w:rPr>
+        <w:t>DLL integration</w:t>
       </w:r>
       <w:r>
         <w:rPr>
@@ -1197,7 +1423,7 @@
       </w:pPr>
     </w:p>
     <w:sectPr>
-      <w:headerReference w:type="default" r:id="rId11"/>
+      <w:headerReference w:type="default" r:id="rId12"/>
       <w:pgSz w:w="11906" w:h="16838"/>
       <w:pgMar w:top="1440" w:right="1440" w:bottom="1440" w:left="1440" w:header="708" w:footer="708" w:gutter="0"/>
       <w:cols w:space="708"/>
@@ -2184,7 +2410,6 @@
   <w:style w:type="character" w:default="1" w:styleId="DefaultParagraphFont">
     <w:name w:val="Default Paragraph Font"/>
     <w:uiPriority w:val="1"/>
-    <w:semiHidden/>
     <w:unhideWhenUsed/>
   </w:style>
   <w:style w:type="table" w:default="1" w:styleId="TableNormal">

</xml_diff>

<commit_message>
Updated Skynet provider links
Updated Skynet provider links
</commit_message>
<xml_diff>
--- a/Chee-Wee Chua's Portfolio of Projects.docx
+++ b/Chee-Wee Chua's Portfolio of Projects.docx
@@ -1,6 +1,6 @@
 
 <file path=word/document.xml><?xml version="1.0" encoding="utf-8"?>
-<w:document xmlns:wpc="http://schemas.microsoft.com/office/word/2010/wordprocessingCanvas" xmlns:mc="http://schemas.openxmlformats.org/markup-compatibility/2006" xmlns:o="urn:schemas-microsoft-com:office:office" xmlns:r="http://schemas.openxmlformats.org/officeDocument/2006/relationships" xmlns:m="http://schemas.openxmlformats.org/officeDocument/2006/math" xmlns:v="urn:schemas-microsoft-com:vml" xmlns:wp14="http://schemas.microsoft.com/office/word/2010/wordprocessingDrawing" xmlns:wp="http://schemas.openxmlformats.org/drawingml/2006/wordprocessingDrawing" xmlns:w10="urn:schemas-microsoft-com:office:word" xmlns:w="http://schemas.openxmlformats.org/wordprocessingml/2006/main" xmlns:w14="http://schemas.microsoft.com/office/word/2010/wordml" xmlns:w15="http://schemas.microsoft.com/office/word/2012/wordml" xmlns:wpg="http://schemas.microsoft.com/office/word/2010/wordprocessingGroup" xmlns:wpi="http://schemas.microsoft.com/office/word/2010/wordprocessingInk" xmlns:wne="http://schemas.microsoft.com/office/word/2006/wordml" xmlns:wps="http://schemas.microsoft.com/office/word/2010/wordprocessingShape" mc:Ignorable="w14 w15 wp14">
+<w:document xmlns:wpc="http://schemas.microsoft.com/office/word/2010/wordprocessingCanvas" xmlns:cx="http://schemas.microsoft.com/office/drawing/2014/chartex" xmlns:cx1="http://schemas.microsoft.com/office/drawing/2015/9/8/chartex" xmlns:cx2="http://schemas.microsoft.com/office/drawing/2015/10/21/chartex" xmlns:cx3="http://schemas.microsoft.com/office/drawing/2016/5/9/chartex" xmlns:cx4="http://schemas.microsoft.com/office/drawing/2016/5/10/chartex" xmlns:cx5="http://schemas.microsoft.com/office/drawing/2016/5/11/chartex" xmlns:cx6="http://schemas.microsoft.com/office/drawing/2016/5/12/chartex" xmlns:cx7="http://schemas.microsoft.com/office/drawing/2016/5/13/chartex" xmlns:cx8="http://schemas.microsoft.com/office/drawing/2016/5/14/chartex" xmlns:mc="http://schemas.openxmlformats.org/markup-compatibility/2006" xmlns:aink="http://schemas.microsoft.com/office/drawing/2016/ink" xmlns:am3d="http://schemas.microsoft.com/office/drawing/2017/model3d" xmlns:o="urn:schemas-microsoft-com:office:office" xmlns:oel="http://schemas.microsoft.com/office/2019/extlst" xmlns:r="http://schemas.openxmlformats.org/officeDocument/2006/relationships" xmlns:m="http://schemas.openxmlformats.org/officeDocument/2006/math" xmlns:v="urn:schemas-microsoft-com:vml" xmlns:wp14="http://schemas.microsoft.com/office/word/2010/wordprocessingDrawing" xmlns:wp="http://schemas.openxmlformats.org/drawingml/2006/wordprocessingDrawing" xmlns:w10="urn:schemas-microsoft-com:office:word" xmlns:w="http://schemas.openxmlformats.org/wordprocessingml/2006/main" xmlns:w14="http://schemas.microsoft.com/office/word/2010/wordml" xmlns:w15="http://schemas.microsoft.com/office/word/2012/wordml" xmlns:w16cex="http://schemas.microsoft.com/office/word/2018/wordml/cex" xmlns:w16cid="http://schemas.microsoft.com/office/word/2016/wordml/cid" xmlns:w16="http://schemas.microsoft.com/office/word/2018/wordml" xmlns:w16du="http://schemas.microsoft.com/office/word/2023/wordml/word16du" xmlns:w16sdtdh="http://schemas.microsoft.com/office/word/2020/wordml/sdtdatahash" xmlns:w16sdtfl="http://schemas.microsoft.com/office/word/2024/wordml/sdtformatlock" xmlns:w16se="http://schemas.microsoft.com/office/word/2015/wordml/symex" xmlns:wpg="http://schemas.microsoft.com/office/word/2010/wordprocessingGroup" xmlns:wpi="http://schemas.microsoft.com/office/word/2010/wordprocessingInk" xmlns:wne="http://schemas.microsoft.com/office/word/2006/wordml" xmlns:wps="http://schemas.microsoft.com/office/word/2010/wordprocessingShape" mc:Ignorable="w14 w15 w16se w16cid w16 w16cex w16sdtdh w16sdtfl w16du wp14">
   <w:body>
     <w:p>
       <w:pPr>
@@ -35,27 +35,138 @@
         <w:t xml:space="preserve">A library of routines that provides blockchain-related utilities, available on  </w:t>
       </w:r>
       <w:hyperlink r:id="rId8" w:history="1">
-        <w:proofErr w:type="spellStart"/>
         <w:r>
           <w:rPr>
             <w:rStyle w:val="Hyperlink"/>
             <w:lang w:val="en-US"/>
           </w:rPr>
-          <w:t>npm</w:t>
+          <w:t>npm registry</w:t>
         </w:r>
-        <w:proofErr w:type="spellEnd"/>
+      </w:hyperlink>
+      <w:r>
+        <w:rPr>
+          <w:lang w:val="en-US"/>
+        </w:rPr>
+        <w:t>.</w:t>
+      </w:r>
+    </w:p>
+    <w:p>
+      <w:pPr>
+        <w:rPr>
+          <w:lang w:val="en-US"/>
+        </w:rPr>
+      </w:pPr>
+      <w:r>
+        <w:rPr>
+          <w:lang w:val="en-US"/>
+        </w:rPr>
+        <w:t>Skills: TypeScript, Web3, Node.js</w:t>
+      </w:r>
+    </w:p>
+    <w:p>
+      <w:pPr>
+        <w:rPr>
+          <w:rStyle w:val="Heading1Char"/>
+        </w:rPr>
+      </w:pPr>
+      <w:r>
+        <w:rPr>
+          <w:rStyle w:val="Heading1Char"/>
+        </w:rPr>
+        <w:t>Open source Ronin SkyNet Web3 and JSON RPC provider</w:t>
+      </w:r>
+      <w:r>
+        <w:rPr>
+          <w:rStyle w:val="Heading1Char"/>
+        </w:rPr>
+        <w:t>s</w:t>
+      </w:r>
+    </w:p>
+    <w:p>
+      <w:pPr>
+        <w:rPr>
+          <w:lang w:val="en-US"/>
+        </w:rPr>
+      </w:pPr>
+      <w:r>
+        <w:rPr>
+          <w:lang w:val="en-US"/>
+        </w:rPr>
+        <w:t xml:space="preserve">A library consisting of a JSON RPC </w:t>
+      </w:r>
+      <w:r>
+        <w:rPr>
+          <w:lang w:val="en-US"/>
+        </w:rPr>
+        <w:t>(</w:t>
+      </w:r>
+      <w:hyperlink r:id="rId9" w:history="1">
         <w:r>
           <w:rPr>
             <w:rStyle w:val="Hyperlink"/>
             <w:lang w:val="en-US"/>
           </w:rPr>
-          <w:t xml:space="preserve"> registry</w:t>
+          <w:t>docs</w:t>
         </w:r>
       </w:hyperlink>
       <w:r>
         <w:rPr>
           <w:lang w:val="en-US"/>
         </w:rPr>
+        <w:t>), Skynet REST (</w:t>
+      </w:r>
+      <w:hyperlink r:id="rId10" w:history="1">
+        <w:r>
+          <w:rPr>
+            <w:rStyle w:val="Hyperlink"/>
+            <w:lang w:val="en-US"/>
+          </w:rPr>
+          <w:t>docs</w:t>
+        </w:r>
+      </w:hyperlink>
+      <w:r>
+        <w:rPr>
+          <w:lang w:val="en-US"/>
+        </w:rPr>
+        <w:t xml:space="preserve">) </w:t>
+      </w:r>
+      <w:r>
+        <w:rPr>
+          <w:lang w:val="en-US"/>
+        </w:rPr>
+        <w:t xml:space="preserve">and Skynet Web3 provider </w:t>
+      </w:r>
+      <w:r>
+        <w:rPr>
+          <w:lang w:val="en-US"/>
+        </w:rPr>
+        <w:t>(</w:t>
+      </w:r>
+      <w:hyperlink r:id="rId11" w:history="1">
+        <w:r>
+          <w:rPr>
+            <w:rStyle w:val="Hyperlink"/>
+            <w:lang w:val="en-US"/>
+          </w:rPr>
+          <w:t>docs</w:t>
+        </w:r>
+      </w:hyperlink>
+      <w:r>
+        <w:rPr>
+          <w:lang w:val="en-US"/>
+        </w:rPr>
+        <w:t xml:space="preserve">) </w:t>
+      </w:r>
+      <w:r>
+        <w:rPr>
+          <w:lang w:val="en-US"/>
+        </w:rPr>
+        <w:t>for Ronin</w:t>
+      </w:r>
+      <w:r>
+        <w:rPr>
+          <w:lang w:val="en-US"/>
+        </w:rPr>
         <w:t>.</w:t>
       </w:r>
     </w:p>
@@ -82,65 +193,6 @@
         <w:rPr>
           <w:rStyle w:val="Heading1Char"/>
         </w:rPr>
-        <w:t xml:space="preserve">Open source Ronin </w:t>
-      </w:r>
-      <w:proofErr w:type="spellStart"/>
-      <w:r>
-        <w:rPr>
-          <w:rStyle w:val="Heading1Char"/>
-        </w:rPr>
-        <w:t>SkyNet</w:t>
-      </w:r>
-      <w:proofErr w:type="spellEnd"/>
-      <w:r>
-        <w:rPr>
-          <w:rStyle w:val="Heading1Char"/>
-        </w:rPr>
-        <w:t xml:space="preserve"> Web3 and JSON RPC provider</w:t>
-      </w:r>
-      <w:r>
-        <w:rPr>
-          <w:rStyle w:val="Heading1Char"/>
-        </w:rPr>
-        <w:t>s</w:t>
-      </w:r>
-    </w:p>
-    <w:p>
-      <w:pPr>
-        <w:rPr>
-          <w:lang w:val="en-US"/>
-        </w:rPr>
-      </w:pPr>
-      <w:r>
-        <w:rPr>
-          <w:lang w:val="en-US"/>
-        </w:rPr>
-        <w:t>A library consisting of a JSON RPC and Skynet Web3 provider for Ronin.</w:t>
-      </w:r>
-    </w:p>
-    <w:p>
-      <w:pPr>
-        <w:rPr>
-          <w:lang w:val="en-US"/>
-        </w:rPr>
-      </w:pPr>
-      <w:r>
-        <w:rPr>
-          <w:lang w:val="en-US"/>
-        </w:rPr>
-        <w:t>Skills: TypeScript, Web3, Node.js</w:t>
-      </w:r>
-    </w:p>
-    <w:p>
-      <w:pPr>
-        <w:rPr>
-          <w:rStyle w:val="Heading1Char"/>
-        </w:rPr>
-      </w:pPr>
-      <w:r>
-        <w:rPr>
-          <w:rStyle w:val="Heading1Char"/>
-        </w:rPr>
         <w:t>Uniswap Hook Donations</w:t>
       </w:r>
     </w:p>
@@ -262,19 +314,11 @@
           <w:rStyle w:val="Heading1Char"/>
         </w:rPr>
       </w:pPr>
-      <w:proofErr w:type="spellStart"/>
-      <w:r>
-        <w:rPr>
-          <w:rStyle w:val="Heading1Char"/>
-        </w:rPr>
-        <w:t>Adspeedup</w:t>
-      </w:r>
-      <w:proofErr w:type="spellEnd"/>
-      <w:r>
-        <w:rPr>
-          <w:rStyle w:val="Heading1Char"/>
-        </w:rPr>
-        <w:t xml:space="preserve"> Extension</w:t>
+      <w:r>
+        <w:rPr>
+          <w:rStyle w:val="Heading1Char"/>
+        </w:rPr>
+        <w:t>Adspeedup Extension</w:t>
       </w:r>
     </w:p>
     <w:p>
@@ -340,39 +384,17 @@
         </w:rPr>
         <w:t xml:space="preserve">transactions on Solana, </w:t>
       </w:r>
-      <w:proofErr w:type="spellStart"/>
-      <w:r>
-        <w:rPr>
-          <w:lang w:val="en-US"/>
-        </w:rPr>
-        <w:t>Polkadot</w:t>
-      </w:r>
-      <w:proofErr w:type="spellEnd"/>
-      <w:r>
-        <w:rPr>
-          <w:lang w:val="en-US"/>
-        </w:rPr>
-        <w:t xml:space="preserve">, </w:t>
-      </w:r>
-      <w:r>
-        <w:rPr>
-          <w:lang w:val="en-US"/>
-        </w:rPr>
-        <w:t xml:space="preserve">Polygon, </w:t>
-      </w:r>
-      <w:proofErr w:type="spellStart"/>
-      <w:r>
-        <w:rPr>
-          <w:lang w:val="en-US"/>
-        </w:rPr>
-        <w:t>Ethereum</w:t>
-      </w:r>
-      <w:proofErr w:type="spellEnd"/>
-      <w:r>
-        <w:rPr>
-          <w:lang w:val="en-US"/>
-        </w:rPr>
-        <w:t xml:space="preserve"> on Node.js</w:t>
+      <w:r>
+        <w:rPr>
+          <w:lang w:val="en-US"/>
+        </w:rPr>
+        <w:t xml:space="preserve">Polkadot, </w:t>
+      </w:r>
+      <w:r>
+        <w:rPr>
+          <w:lang w:val="en-US"/>
+        </w:rPr>
+        <w:t>Polygon, Ethereum on Node.js</w:t>
       </w:r>
       <w:r>
         <w:rPr>
@@ -391,21 +413,7 @@
         <w:rPr>
           <w:lang w:val="en-US"/>
         </w:rPr>
-        <w:t xml:space="preserve">Skills: Node.js, </w:t>
-      </w:r>
-      <w:proofErr w:type="spellStart"/>
-      <w:r>
-        <w:rPr>
-          <w:lang w:val="en-US"/>
-        </w:rPr>
-        <w:t>TypeScript</w:t>
-      </w:r>
-      <w:proofErr w:type="spellEnd"/>
-      <w:r>
-        <w:rPr>
-          <w:lang w:val="en-US"/>
-        </w:rPr>
-        <w:t>, Web</w:t>
+        <w:t>Skills: Node.js, TypeScript, Web</w:t>
       </w:r>
       <w:r>
         <w:rPr>
@@ -442,16 +450,8 @@
         <w:rPr>
           <w:rStyle w:val="Heading1Char"/>
         </w:rPr>
-        <w:t xml:space="preserve">js library - </w:t>
-      </w:r>
-      <w:proofErr w:type="spellStart"/>
-      <w:r>
-        <w:rPr>
-          <w:rStyle w:val="Heading1Char"/>
-        </w:rPr>
-        <w:t>DelphiRTL</w:t>
-      </w:r>
-      <w:proofErr w:type="spellEnd"/>
+        <w:t>js library - DelphiRTL</w:t>
+      </w:r>
       <w:r>
         <w:rPr>
           <w:lang w:val="en-US"/>
@@ -470,120 +470,102 @@
         </w:rPr>
         <w:t xml:space="preserve">A library of routines that provides common functionality, such as JSON RPC, logging, date routines for use on Node.js on </w:t>
       </w:r>
-      <w:hyperlink r:id="rId9" w:history="1">
-        <w:proofErr w:type="spellStart"/>
+      <w:hyperlink r:id="rId12" w:history="1">
         <w:r>
           <w:rPr>
             <w:rStyle w:val="Hyperlink"/>
             <w:lang w:val="en-SG"/>
           </w:rPr>
-          <w:t>npm</w:t>
+          <w:t>npm registry</w:t>
         </w:r>
-        <w:proofErr w:type="spellEnd"/>
+      </w:hyperlink>
+      <w:r>
+        <w:rPr>
+          <w:lang w:val="en-SG"/>
+        </w:rPr>
+        <w:t>.</w:t>
+      </w:r>
+    </w:p>
+    <w:p>
+      <w:pPr>
+        <w:rPr>
+          <w:lang w:val="en-US"/>
+        </w:rPr>
+      </w:pPr>
+      <w:r>
+        <w:rPr>
+          <w:lang w:val="en-US"/>
+        </w:rPr>
+        <w:t>Skills: Node.js, TypeScript</w:t>
+      </w:r>
+    </w:p>
+    <w:p>
+      <w:pPr>
+        <w:rPr>
+          <w:lang w:val="en-SG"/>
+        </w:rPr>
+      </w:pPr>
+      <w:r>
+        <w:rPr>
+          <w:rStyle w:val="Heading1Char"/>
+        </w:rPr>
+        <w:t>Open source Node</w:t>
+      </w:r>
+      <w:r>
+        <w:rPr>
+          <w:rStyle w:val="Heading1Char"/>
+        </w:rPr>
+        <w:t>.</w:t>
+      </w:r>
+      <w:r>
+        <w:rPr>
+          <w:rStyle w:val="Heading1Char"/>
+        </w:rPr>
+        <w:t xml:space="preserve">js library </w:t>
+      </w:r>
+      <w:r>
+        <w:rPr>
+          <w:rStyle w:val="Heading1Char"/>
+        </w:rPr>
+        <w:t>–</w:t>
+      </w:r>
+      <w:r>
+        <w:rPr>
+          <w:rStyle w:val="Heading1Char"/>
+        </w:rPr>
+        <w:t xml:space="preserve"> </w:t>
+      </w:r>
+      <w:r>
+        <w:rPr>
+          <w:rStyle w:val="Heading1Char"/>
+        </w:rPr>
+        <w:t>web3-wallet-api</w:t>
+      </w:r>
+      <w:r>
+        <w:rPr>
+          <w:lang w:val="en-US"/>
+        </w:rPr>
+        <w:t xml:space="preserve"> </w:t>
+      </w:r>
+      <w:r>
+        <w:rPr>
+          <w:lang w:val="en-US"/>
+        </w:rPr>
+        <w:br/>
+      </w:r>
+      <w:r>
+        <w:rPr>
+          <w:lang w:val="en-SG"/>
+        </w:rPr>
+        <w:t xml:space="preserve">A library of routines that provides common Web3 wallets functionality for web browsers, available on </w:t>
+      </w:r>
+      <w:hyperlink r:id="rId13" w:history="1">
         <w:r>
           <w:rPr>
             <w:rStyle w:val="Hyperlink"/>
             <w:lang w:val="en-SG"/>
           </w:rPr>
-          <w:t xml:space="preserve"> registry</w:t>
-        </w:r>
-      </w:hyperlink>
-      <w:r>
-        <w:rPr>
-          <w:lang w:val="en-SG"/>
-        </w:rPr>
-        <w:t>.</w:t>
-      </w:r>
-    </w:p>
-    <w:p>
-      <w:pPr>
-        <w:rPr>
-          <w:lang w:val="en-US"/>
-        </w:rPr>
-      </w:pPr>
-      <w:r>
-        <w:rPr>
-          <w:lang w:val="en-US"/>
-        </w:rPr>
-        <w:t>Skills: Node.js, TypeScript</w:t>
-      </w:r>
-    </w:p>
-    <w:p>
-      <w:pPr>
-        <w:rPr>
-          <w:lang w:val="en-SG"/>
-        </w:rPr>
-      </w:pPr>
-      <w:r>
-        <w:rPr>
-          <w:rStyle w:val="Heading1Char"/>
-        </w:rPr>
-        <w:t>Open source Node</w:t>
-      </w:r>
-      <w:r>
-        <w:rPr>
-          <w:rStyle w:val="Heading1Char"/>
-        </w:rPr>
-        <w:t>.</w:t>
-      </w:r>
-      <w:r>
-        <w:rPr>
-          <w:rStyle w:val="Heading1Char"/>
-        </w:rPr>
-        <w:t xml:space="preserve">js library </w:t>
-      </w:r>
-      <w:r>
-        <w:rPr>
-          <w:rStyle w:val="Heading1Char"/>
-        </w:rPr>
-        <w:t>–</w:t>
-      </w:r>
-      <w:r>
-        <w:rPr>
-          <w:rStyle w:val="Heading1Char"/>
-        </w:rPr>
-        <w:t xml:space="preserve"> </w:t>
-      </w:r>
-      <w:r>
-        <w:rPr>
-          <w:rStyle w:val="Heading1Char"/>
-        </w:rPr>
-        <w:t>web3-wallet-api</w:t>
-      </w:r>
-      <w:r>
-        <w:rPr>
-          <w:lang w:val="en-US"/>
-        </w:rPr>
-        <w:t xml:space="preserve"> </w:t>
-      </w:r>
-      <w:r>
-        <w:rPr>
-          <w:lang w:val="en-US"/>
-        </w:rPr>
-        <w:br/>
-      </w:r>
-      <w:r>
-        <w:rPr>
-          <w:lang w:val="en-SG"/>
-        </w:rPr>
-        <w:t xml:space="preserve">A library of routines that provides common Web3 wallets functionality for web browsers, available on </w:t>
-      </w:r>
-      <w:hyperlink r:id="rId10" w:history="1">
-        <w:proofErr w:type="spellStart"/>
-        <w:r>
-          <w:rPr>
-            <w:rStyle w:val="Hyperlink"/>
-            <w:lang w:val="en-SG"/>
-          </w:rPr>
-          <w:t>npm</w:t>
-        </w:r>
-        <w:proofErr w:type="spellEnd"/>
-        <w:r>
-          <w:rPr>
-            <w:rStyle w:val="Hyperlink"/>
-            <w:lang w:val="en-SG"/>
-          </w:rPr>
-          <w:t xml:space="preserve"> registry</w:t>
+          <w:t>npm registry</w:t>
         </w:r>
       </w:hyperlink>
       <w:r>
@@ -687,14 +669,12 @@
           <w:lang w:val="en-US"/>
         </w:rPr>
       </w:pPr>
-      <w:proofErr w:type="spellStart"/>
       <w:r>
         <w:rPr>
           <w:rStyle w:val="Heading1Char"/>
         </w:rPr>
         <w:t>UpgradeLambda</w:t>
       </w:r>
-      <w:proofErr w:type="spellEnd"/>
       <w:r>
         <w:rPr>
           <w:lang w:val="en-US"/>
@@ -705,21 +685,7 @@
         <w:rPr>
           <w:lang w:val="en-US"/>
         </w:rPr>
-        <w:t xml:space="preserve">Upgrades </w:t>
-      </w:r>
-      <w:proofErr w:type="spellStart"/>
-      <w:r>
-        <w:rPr>
-          <w:lang w:val="en-US"/>
-        </w:rPr>
-        <w:t>blockchain</w:t>
-      </w:r>
-      <w:proofErr w:type="spellEnd"/>
-      <w:r>
-        <w:rPr>
-          <w:lang w:val="en-US"/>
-        </w:rPr>
-        <w:t xml:space="preserve"> node software on AWS, remotely, by connecting using SSH.</w:t>
+        <w:t>Upgrades blockchain node software on AWS, remotely, by connecting using SSH.</w:t>
       </w:r>
     </w:p>
     <w:p>
@@ -841,21 +807,7 @@
         <w:rPr>
           <w:lang w:val="en-US"/>
         </w:rPr>
-        <w:t xml:space="preserve">Skills: </w:t>
-      </w:r>
-      <w:proofErr w:type="spellStart"/>
-      <w:r>
-        <w:rPr>
-          <w:lang w:val="en-US"/>
-        </w:rPr>
-        <w:t>WinAPI</w:t>
-      </w:r>
-      <w:proofErr w:type="spellEnd"/>
-      <w:r>
-        <w:rPr>
-          <w:lang w:val="en-US"/>
-        </w:rPr>
-        <w:t>, Pascal, multi-threading</w:t>
+        <w:t>Skills: WinAPI, Pascal, multi-threading</w:t>
       </w:r>
       <w:r>
         <w:rPr>
@@ -894,21 +846,7 @@
         <w:rPr>
           <w:lang w:val="en-US"/>
         </w:rPr>
-        <w:t xml:space="preserve">The design and development of a donation system in </w:t>
-      </w:r>
-      <w:proofErr w:type="spellStart"/>
-      <w:r>
-        <w:rPr>
-          <w:lang w:val="en-US"/>
-        </w:rPr>
-        <w:t>Ethereum</w:t>
-      </w:r>
-      <w:proofErr w:type="spellEnd"/>
-      <w:r>
-        <w:rPr>
-          <w:lang w:val="en-US"/>
-        </w:rPr>
-        <w:t xml:space="preserve"> </w:t>
+        <w:t xml:space="preserve">The design and development of a donation system in Ethereum </w:t>
       </w:r>
       <w:r>
         <w:rPr>
@@ -916,14 +854,12 @@
         </w:rPr>
         <w:t xml:space="preserve">and Solana </w:t>
       </w:r>
-      <w:proofErr w:type="spellStart"/>
       <w:r>
         <w:rPr>
           <w:lang w:val="en-US"/>
         </w:rPr>
         <w:t>blockchain</w:t>
       </w:r>
-      <w:proofErr w:type="spellEnd"/>
       <w:r>
         <w:rPr>
           <w:lang w:val="en-US"/>
@@ -961,33 +897,75 @@
         </w:rPr>
         <w:t xml:space="preserve">Skills: Solidity, </w:t>
       </w:r>
-      <w:proofErr w:type="spellStart"/>
-      <w:r>
-        <w:rPr>
-          <w:lang w:val="en-US"/>
-        </w:rPr>
-        <w:t>Ethereum</w:t>
-      </w:r>
-      <w:proofErr w:type="spellEnd"/>
-      <w:r>
-        <w:rPr>
-          <w:lang w:val="en-US"/>
-        </w:rPr>
-        <w:t xml:space="preserve">, </w:t>
-      </w:r>
-      <w:proofErr w:type="spellStart"/>
-      <w:r>
-        <w:rPr>
-          <w:lang w:val="en-US"/>
-        </w:rPr>
-        <w:t>TypeScript</w:t>
-      </w:r>
-      <w:proofErr w:type="spellEnd"/>
-      <w:r>
-        <w:rPr>
-          <w:lang w:val="en-US"/>
-        </w:rPr>
-        <w:t>, CSS</w:t>
+      <w:r>
+        <w:rPr>
+          <w:lang w:val="en-US"/>
+        </w:rPr>
+        <w:t xml:space="preserve">Ethereum, </w:t>
+      </w:r>
+      <w:r>
+        <w:rPr>
+          <w:lang w:val="en-US"/>
+        </w:rPr>
+        <w:t>TypeScript, CSS</w:t>
+      </w:r>
+      <w:r>
+        <w:rPr>
+          <w:lang w:val="en-US"/>
+        </w:rPr>
+        <w:t>, Solana</w:t>
+      </w:r>
+      <w:r>
+        <w:rPr>
+          <w:lang w:val="en-US"/>
+        </w:rPr>
+        <w:t>, Anchor</w:t>
+      </w:r>
+      <w:r>
+        <w:rPr>
+          <w:lang w:val="en-US"/>
+        </w:rPr>
+        <w:t>.</w:t>
+      </w:r>
+    </w:p>
+    <w:p>
+      <w:pPr>
+        <w:pStyle w:val="Heading1"/>
+        <w:rPr>
+          <w:lang w:val="en-US"/>
+        </w:rPr>
+      </w:pPr>
+      <w:r>
+        <w:rPr>
+          <w:lang w:val="en-US"/>
+        </w:rPr>
+        <w:t>JSON RPC Framework</w:t>
+      </w:r>
+    </w:p>
+    <w:p>
+      <w:pPr>
+        <w:rPr>
+          <w:lang w:val="en-US"/>
+        </w:rPr>
+      </w:pPr>
+      <w:r>
+        <w:rPr>
+          <w:lang w:val="en-US"/>
+        </w:rPr>
+        <w:t>A JSON RPC Framework that allows easy dispatching of JSON RPC calls, with Aptos, Bitcoin, Ethereum, Polkadot and Solana clients.</w:t>
+      </w:r>
+    </w:p>
+    <w:p>
+      <w:pPr>
+        <w:rPr>
+          <w:lang w:val="en-US"/>
+        </w:rPr>
+      </w:pPr>
+      <w:r>
+        <w:rPr>
+          <w:lang w:val="en-US"/>
+        </w:rPr>
+        <w:t>Skills: JSON RPC, Object Pascal</w:t>
       </w:r>
       <w:r>
         <w:rPr>
@@ -995,6 +973,13 @@
         </w:rPr>
         <w:t>, Solana.</w:t>
       </w:r>
+      <w:r>
+        <w:rPr>
+          <w:lang w:val="en-US"/>
+        </w:rPr>
+        <w:br/>
+        <w:t>Blockchains: Aptos, Bitcoin, Ethereum, Polkadot, Solana.</w:t>
+      </w:r>
     </w:p>
     <w:p>
       <w:pPr>
@@ -1007,139 +992,7 @@
         <w:rPr>
           <w:lang w:val="en-US"/>
         </w:rPr>
-        <w:t>JSON RPC Framework</w:t>
-      </w:r>
-    </w:p>
-    <w:p>
-      <w:pPr>
-        <w:rPr>
-          <w:lang w:val="en-US"/>
-        </w:rPr>
-      </w:pPr>
-      <w:r>
-        <w:rPr>
-          <w:lang w:val="en-US"/>
-        </w:rPr>
-        <w:t xml:space="preserve">A JSON RPC Framework that allows easy dispatching of JSON RPC calls, with Aptos, Bitcoin, </w:t>
-      </w:r>
-      <w:proofErr w:type="spellStart"/>
-      <w:r>
-        <w:rPr>
-          <w:lang w:val="en-US"/>
-        </w:rPr>
-        <w:t>Ethereum</w:t>
-      </w:r>
-      <w:proofErr w:type="spellEnd"/>
-      <w:r>
-        <w:rPr>
-          <w:lang w:val="en-US"/>
-        </w:rPr>
-        <w:t xml:space="preserve">, </w:t>
-      </w:r>
-      <w:proofErr w:type="spellStart"/>
-      <w:r>
-        <w:rPr>
-          <w:lang w:val="en-US"/>
-        </w:rPr>
-        <w:t>Polkadot</w:t>
-      </w:r>
-      <w:proofErr w:type="spellEnd"/>
-      <w:r>
-        <w:rPr>
-          <w:lang w:val="en-US"/>
-        </w:rPr>
-        <w:t xml:space="preserve"> and Solana clients.</w:t>
-      </w:r>
-    </w:p>
-    <w:p>
-      <w:pPr>
-        <w:rPr>
-          <w:lang w:val="en-US"/>
-        </w:rPr>
-      </w:pPr>
-      <w:r>
-        <w:rPr>
-          <w:lang w:val="en-US"/>
-        </w:rPr>
-        <w:t>Skills: JSON RPC, Object Pascal</w:t>
-      </w:r>
-      <w:r>
-        <w:rPr>
-          <w:lang w:val="en-US"/>
-        </w:rPr>
-        <w:t>, Solana.</w:t>
-      </w:r>
-      <w:bookmarkStart w:id="0" w:name="_GoBack"/>
-      <w:bookmarkEnd w:id="0"/>
-      <w:r>
-        <w:rPr>
-          <w:lang w:val="en-US"/>
-        </w:rPr>
-        <w:br/>
-      </w:r>
-      <w:proofErr w:type="spellStart"/>
-      <w:r>
-        <w:rPr>
-          <w:lang w:val="en-US"/>
-        </w:rPr>
-        <w:t>Blockchains</w:t>
-      </w:r>
-      <w:proofErr w:type="spellEnd"/>
-      <w:r>
-        <w:rPr>
-          <w:lang w:val="en-US"/>
-        </w:rPr>
-        <w:t xml:space="preserve">: Aptos, Bitcoin, </w:t>
-      </w:r>
-      <w:proofErr w:type="spellStart"/>
-      <w:r>
-        <w:rPr>
-          <w:lang w:val="en-US"/>
-        </w:rPr>
-        <w:t>Ethereum</w:t>
-      </w:r>
-      <w:proofErr w:type="spellEnd"/>
-      <w:r>
-        <w:rPr>
-          <w:lang w:val="en-US"/>
-        </w:rPr>
-        <w:t xml:space="preserve">, </w:t>
-      </w:r>
-      <w:proofErr w:type="spellStart"/>
-      <w:r>
-        <w:rPr>
-          <w:lang w:val="en-US"/>
-        </w:rPr>
-        <w:t>Polkadot</w:t>
-      </w:r>
-      <w:proofErr w:type="spellEnd"/>
-      <w:r>
-        <w:rPr>
-          <w:lang w:val="en-US"/>
-        </w:rPr>
-        <w:t>, Solana.</w:t>
-      </w:r>
-    </w:p>
-    <w:p>
-      <w:pPr>
-        <w:pStyle w:val="Heading1"/>
-        <w:rPr>
-          <w:lang w:val="en-US"/>
-        </w:rPr>
-      </w:pPr>
-      <w:proofErr w:type="spellStart"/>
-      <w:r>
-        <w:rPr>
-          <w:lang w:val="en-US"/>
-        </w:rPr>
-        <w:t>WebSockets</w:t>
-      </w:r>
-      <w:proofErr w:type="spellEnd"/>
-      <w:r>
-        <w:rPr>
-          <w:lang w:val="en-US"/>
-        </w:rPr>
-        <w:t xml:space="preserve"> Framework</w:t>
+        <w:t>WebSockets Framework</w:t>
       </w:r>
     </w:p>
     <w:p>
@@ -1165,21 +1018,7 @@
         <w:rPr>
           <w:lang w:val="en-US"/>
         </w:rPr>
-        <w:t xml:space="preserve">Skills: </w:t>
-      </w:r>
-      <w:proofErr w:type="spellStart"/>
-      <w:r>
-        <w:rPr>
-          <w:lang w:val="en-US"/>
-        </w:rPr>
-        <w:t>WebSockets</w:t>
-      </w:r>
-      <w:proofErr w:type="spellEnd"/>
-      <w:r>
-        <w:rPr>
-          <w:lang w:val="en-US"/>
-        </w:rPr>
-        <w:t>, Object Pascal</w:t>
+        <w:t>Skills: WebSockets, Object Pascal</w:t>
       </w:r>
     </w:p>
     <w:p>
@@ -1240,7 +1079,6 @@
           <w:lang w:val="en-US"/>
         </w:rPr>
       </w:pPr>
-      <w:proofErr w:type="spellStart"/>
       <w:r>
         <w:rPr>
           <w:rStyle w:val="Heading1Char"/>
@@ -1248,7 +1086,6 @@
         <w:lastRenderedPageBreak/>
         <w:t>StopMercuryAttacks</w:t>
       </w:r>
-      <w:proofErr w:type="spellEnd"/>
       <w:r>
         <w:rPr>
           <w:u w:val="single"/>
@@ -1262,7 +1099,7 @@
         </w:rPr>
         <w:t xml:space="preserve">External plugins to the </w:t>
       </w:r>
-      <w:hyperlink r:id="rId11" w:history="1">
+      <w:hyperlink r:id="rId14" w:history="1">
         <w:r>
           <w:rPr>
             <w:rStyle w:val="Hyperlink"/>
@@ -1295,19 +1132,11 @@
           <w:lang w:val="en-SG"/>
         </w:rPr>
       </w:pPr>
-      <w:proofErr w:type="spellStart"/>
-      <w:r>
-        <w:rPr>
-          <w:lang w:val="en-SG"/>
-        </w:rPr>
-        <w:t>StopMercuryAttacks</w:t>
-      </w:r>
-      <w:proofErr w:type="spellEnd"/>
-      <w:r>
-        <w:rPr>
-          <w:lang w:val="en-SG"/>
-        </w:rPr>
-        <w:t xml:space="preserve"> is a Delphi project group consisting of 3 plugin projects:</w:t>
+      <w:r>
+        <w:rPr>
+          <w:lang w:val="en-SG"/>
+        </w:rPr>
+        <w:t>StopMercuryAttacks is a Delphi project group consisting of 3 plugin projects:</w:t>
       </w:r>
     </w:p>
     <w:p>
@@ -1320,14 +1149,12 @@
           <w:lang w:val="en-SG"/>
         </w:rPr>
       </w:pPr>
-      <w:proofErr w:type="spellStart"/>
       <w:r>
         <w:rPr>
           <w:lang w:val="en-SG"/>
         </w:rPr>
         <w:t>Mercury.Daemons.StopSMTPAttacks</w:t>
       </w:r>
-      <w:proofErr w:type="spellEnd"/>
     </w:p>
     <w:p>
       <w:pPr>
@@ -1544,7 +1371,7 @@
       </w:pPr>
     </w:p>
     <w:sectPr>
-      <w:headerReference w:type="default" r:id="rId12"/>
+      <w:headerReference w:type="default" r:id="rId15"/>
       <w:pgSz w:w="11906" w:h="16838"/>
       <w:pgMar w:top="1440" w:right="1440" w:bottom="1440" w:left="1440" w:header="708" w:footer="708" w:gutter="0"/>
       <w:cols w:space="708"/>
@@ -1555,7 +1382,7 @@
 </file>
 
 <file path=word/endnotes.xml><?xml version="1.0" encoding="utf-8"?>
-<w:endnotes xmlns:wpc="http://schemas.microsoft.com/office/word/2010/wordprocessingCanvas" xmlns:mc="http://schemas.openxmlformats.org/markup-compatibility/2006" xmlns:o="urn:schemas-microsoft-com:office:office" xmlns:r="http://schemas.openxmlformats.org/officeDocument/2006/relationships" xmlns:m="http://schemas.openxmlformats.org/officeDocument/2006/math" xmlns:v="urn:schemas-microsoft-com:vml" xmlns:wp14="http://schemas.microsoft.com/office/word/2010/wordprocessingDrawing" xmlns:wp="http://schemas.openxmlformats.org/drawingml/2006/wordprocessingDrawing" xmlns:w10="urn:schemas-microsoft-com:office:word" xmlns:w="http://schemas.openxmlformats.org/wordprocessingml/2006/main" xmlns:w14="http://schemas.microsoft.com/office/word/2010/wordml" xmlns:w15="http://schemas.microsoft.com/office/word/2012/wordml" xmlns:wpg="http://schemas.microsoft.com/office/word/2010/wordprocessingGroup" xmlns:wpi="http://schemas.microsoft.com/office/word/2010/wordprocessingInk" xmlns:wne="http://schemas.microsoft.com/office/word/2006/wordml" xmlns:wps="http://schemas.microsoft.com/office/word/2010/wordprocessingShape" mc:Ignorable="w14 w15 wp14">
+<w:endnotes xmlns:wpc="http://schemas.microsoft.com/office/word/2010/wordprocessingCanvas" xmlns:cx="http://schemas.microsoft.com/office/drawing/2014/chartex" xmlns:cx1="http://schemas.microsoft.com/office/drawing/2015/9/8/chartex" xmlns:cx2="http://schemas.microsoft.com/office/drawing/2015/10/21/chartex" xmlns:cx3="http://schemas.microsoft.com/office/drawing/2016/5/9/chartex" xmlns:cx4="http://schemas.microsoft.com/office/drawing/2016/5/10/chartex" xmlns:cx5="http://schemas.microsoft.com/office/drawing/2016/5/11/chartex" xmlns:cx6="http://schemas.microsoft.com/office/drawing/2016/5/12/chartex" xmlns:cx7="http://schemas.microsoft.com/office/drawing/2016/5/13/chartex" xmlns:cx8="http://schemas.microsoft.com/office/drawing/2016/5/14/chartex" xmlns:mc="http://schemas.openxmlformats.org/markup-compatibility/2006" xmlns:aink="http://schemas.microsoft.com/office/drawing/2016/ink" xmlns:am3d="http://schemas.microsoft.com/office/drawing/2017/model3d" xmlns:o="urn:schemas-microsoft-com:office:office" xmlns:oel="http://schemas.microsoft.com/office/2019/extlst" xmlns:r="http://schemas.openxmlformats.org/officeDocument/2006/relationships" xmlns:m="http://schemas.openxmlformats.org/officeDocument/2006/math" xmlns:v="urn:schemas-microsoft-com:vml" xmlns:wp14="http://schemas.microsoft.com/office/word/2010/wordprocessingDrawing" xmlns:wp="http://schemas.openxmlformats.org/drawingml/2006/wordprocessingDrawing" xmlns:w10="urn:schemas-microsoft-com:office:word" xmlns:w="http://schemas.openxmlformats.org/wordprocessingml/2006/main" xmlns:w14="http://schemas.microsoft.com/office/word/2010/wordml" xmlns:w15="http://schemas.microsoft.com/office/word/2012/wordml" xmlns:w16cex="http://schemas.microsoft.com/office/word/2018/wordml/cex" xmlns:w16cid="http://schemas.microsoft.com/office/word/2016/wordml/cid" xmlns:w16="http://schemas.microsoft.com/office/word/2018/wordml" xmlns:w16du="http://schemas.microsoft.com/office/word/2023/wordml/word16du" xmlns:w16sdtdh="http://schemas.microsoft.com/office/word/2020/wordml/sdtdatahash" xmlns:w16sdtfl="http://schemas.microsoft.com/office/word/2024/wordml/sdtformatlock" xmlns:w16se="http://schemas.microsoft.com/office/word/2015/wordml/symex" xmlns:wpg="http://schemas.microsoft.com/office/word/2010/wordprocessingGroup" xmlns:wpi="http://schemas.microsoft.com/office/word/2010/wordprocessingInk" xmlns:wne="http://schemas.microsoft.com/office/word/2006/wordml" xmlns:wps="http://schemas.microsoft.com/office/word/2010/wordprocessingShape" mc:Ignorable="w14 w15 w16se w16cid w16 w16cex w16sdtdh w16sdtfl w16du wp14">
   <w:endnote w:type="separator" w:id="-1">
     <w:p>
       <w:pPr>
@@ -1580,7 +1407,7 @@
 </file>
 
 <file path=word/footnotes.xml><?xml version="1.0" encoding="utf-8"?>
-<w:footnotes xmlns:wpc="http://schemas.microsoft.com/office/word/2010/wordprocessingCanvas" xmlns:mc="http://schemas.openxmlformats.org/markup-compatibility/2006" xmlns:o="urn:schemas-microsoft-com:office:office" xmlns:r="http://schemas.openxmlformats.org/officeDocument/2006/relationships" xmlns:m="http://schemas.openxmlformats.org/officeDocument/2006/math" xmlns:v="urn:schemas-microsoft-com:vml" xmlns:wp14="http://schemas.microsoft.com/office/word/2010/wordprocessingDrawing" xmlns:wp="http://schemas.openxmlformats.org/drawingml/2006/wordprocessingDrawing" xmlns:w10="urn:schemas-microsoft-com:office:word" xmlns:w="http://schemas.openxmlformats.org/wordprocessingml/2006/main" xmlns:w14="http://schemas.microsoft.com/office/word/2010/wordml" xmlns:w15="http://schemas.microsoft.com/office/word/2012/wordml" xmlns:wpg="http://schemas.microsoft.com/office/word/2010/wordprocessingGroup" xmlns:wpi="http://schemas.microsoft.com/office/word/2010/wordprocessingInk" xmlns:wne="http://schemas.microsoft.com/office/word/2006/wordml" xmlns:wps="http://schemas.microsoft.com/office/word/2010/wordprocessingShape" mc:Ignorable="w14 w15 wp14">
+<w:footnotes xmlns:wpc="http://schemas.microsoft.com/office/word/2010/wordprocessingCanvas" xmlns:cx="http://schemas.microsoft.com/office/drawing/2014/chartex" xmlns:cx1="http://schemas.microsoft.com/office/drawing/2015/9/8/chartex" xmlns:cx2="http://schemas.microsoft.com/office/drawing/2015/10/21/chartex" xmlns:cx3="http://schemas.microsoft.com/office/drawing/2016/5/9/chartex" xmlns:cx4="http://schemas.microsoft.com/office/drawing/2016/5/10/chartex" xmlns:cx5="http://schemas.microsoft.com/office/drawing/2016/5/11/chartex" xmlns:cx6="http://schemas.microsoft.com/office/drawing/2016/5/12/chartex" xmlns:cx7="http://schemas.microsoft.com/office/drawing/2016/5/13/chartex" xmlns:cx8="http://schemas.microsoft.com/office/drawing/2016/5/14/chartex" xmlns:mc="http://schemas.openxmlformats.org/markup-compatibility/2006" xmlns:aink="http://schemas.microsoft.com/office/drawing/2016/ink" xmlns:am3d="http://schemas.microsoft.com/office/drawing/2017/model3d" xmlns:o="urn:schemas-microsoft-com:office:office" xmlns:oel="http://schemas.microsoft.com/office/2019/extlst" xmlns:r="http://schemas.openxmlformats.org/officeDocument/2006/relationships" xmlns:m="http://schemas.openxmlformats.org/officeDocument/2006/math" xmlns:v="urn:schemas-microsoft-com:vml" xmlns:wp14="http://schemas.microsoft.com/office/word/2010/wordprocessingDrawing" xmlns:wp="http://schemas.openxmlformats.org/drawingml/2006/wordprocessingDrawing" xmlns:w10="urn:schemas-microsoft-com:office:word" xmlns:w="http://schemas.openxmlformats.org/wordprocessingml/2006/main" xmlns:w14="http://schemas.microsoft.com/office/word/2010/wordml" xmlns:w15="http://schemas.microsoft.com/office/word/2012/wordml" xmlns:w16cex="http://schemas.microsoft.com/office/word/2018/wordml/cex" xmlns:w16cid="http://schemas.microsoft.com/office/word/2016/wordml/cid" xmlns:w16="http://schemas.microsoft.com/office/word/2018/wordml" xmlns:w16du="http://schemas.microsoft.com/office/word/2023/wordml/word16du" xmlns:w16sdtdh="http://schemas.microsoft.com/office/word/2020/wordml/sdtdatahash" xmlns:w16sdtfl="http://schemas.microsoft.com/office/word/2024/wordml/sdtformatlock" xmlns:w16se="http://schemas.microsoft.com/office/word/2015/wordml/symex" xmlns:wpg="http://schemas.microsoft.com/office/word/2010/wordprocessingGroup" xmlns:wpi="http://schemas.microsoft.com/office/word/2010/wordprocessingInk" xmlns:wne="http://schemas.microsoft.com/office/word/2006/wordml" xmlns:wps="http://schemas.microsoft.com/office/word/2010/wordprocessingShape" mc:Ignorable="w14 w15 w16se w16cid w16 w16cex w16sdtdh w16sdtfl w16du wp14">
   <w:footnote w:type="separator" w:id="-1">
     <w:p>
       <w:pPr>
@@ -1605,7 +1432,7 @@
 </file>
 
 <file path=word/header1.xml><?xml version="1.0" encoding="utf-8"?>
-<w:hdr xmlns:wpc="http://schemas.microsoft.com/office/word/2010/wordprocessingCanvas" xmlns:mc="http://schemas.openxmlformats.org/markup-compatibility/2006" xmlns:o="urn:schemas-microsoft-com:office:office" xmlns:r="http://schemas.openxmlformats.org/officeDocument/2006/relationships" xmlns:m="http://schemas.openxmlformats.org/officeDocument/2006/math" xmlns:v="urn:schemas-microsoft-com:vml" xmlns:wp14="http://schemas.microsoft.com/office/word/2010/wordprocessingDrawing" xmlns:wp="http://schemas.openxmlformats.org/drawingml/2006/wordprocessingDrawing" xmlns:w10="urn:schemas-microsoft-com:office:word" xmlns:w="http://schemas.openxmlformats.org/wordprocessingml/2006/main" xmlns:w14="http://schemas.microsoft.com/office/word/2010/wordml" xmlns:w15="http://schemas.microsoft.com/office/word/2012/wordml" xmlns:wpg="http://schemas.microsoft.com/office/word/2010/wordprocessingGroup" xmlns:wpi="http://schemas.microsoft.com/office/word/2010/wordprocessingInk" xmlns:wne="http://schemas.microsoft.com/office/word/2006/wordml" xmlns:wps="http://schemas.microsoft.com/office/word/2010/wordprocessingShape" mc:Ignorable="w14 w15 wp14">
+<w:hdr xmlns:wpc="http://schemas.microsoft.com/office/word/2010/wordprocessingCanvas" xmlns:cx="http://schemas.microsoft.com/office/drawing/2014/chartex" xmlns:cx1="http://schemas.microsoft.com/office/drawing/2015/9/8/chartex" xmlns:cx2="http://schemas.microsoft.com/office/drawing/2015/10/21/chartex" xmlns:cx3="http://schemas.microsoft.com/office/drawing/2016/5/9/chartex" xmlns:cx4="http://schemas.microsoft.com/office/drawing/2016/5/10/chartex" xmlns:cx5="http://schemas.microsoft.com/office/drawing/2016/5/11/chartex" xmlns:cx6="http://schemas.microsoft.com/office/drawing/2016/5/12/chartex" xmlns:cx7="http://schemas.microsoft.com/office/drawing/2016/5/13/chartex" xmlns:cx8="http://schemas.microsoft.com/office/drawing/2016/5/14/chartex" xmlns:mc="http://schemas.openxmlformats.org/markup-compatibility/2006" xmlns:aink="http://schemas.microsoft.com/office/drawing/2016/ink" xmlns:am3d="http://schemas.microsoft.com/office/drawing/2017/model3d" xmlns:o="urn:schemas-microsoft-com:office:office" xmlns:oel="http://schemas.microsoft.com/office/2019/extlst" xmlns:r="http://schemas.openxmlformats.org/officeDocument/2006/relationships" xmlns:m="http://schemas.openxmlformats.org/officeDocument/2006/math" xmlns:v="urn:schemas-microsoft-com:vml" xmlns:wp14="http://schemas.microsoft.com/office/word/2010/wordprocessingDrawing" xmlns:wp="http://schemas.openxmlformats.org/drawingml/2006/wordprocessingDrawing" xmlns:w10="urn:schemas-microsoft-com:office:word" xmlns:w="http://schemas.openxmlformats.org/wordprocessingml/2006/main" xmlns:w14="http://schemas.microsoft.com/office/word/2010/wordml" xmlns:w15="http://schemas.microsoft.com/office/word/2012/wordml" xmlns:w16cex="http://schemas.microsoft.com/office/word/2018/wordml/cex" xmlns:w16cid="http://schemas.microsoft.com/office/word/2016/wordml/cid" xmlns:w16="http://schemas.microsoft.com/office/word/2018/wordml" xmlns:w16du="http://schemas.microsoft.com/office/word/2023/wordml/word16du" xmlns:w16sdtdh="http://schemas.microsoft.com/office/word/2020/wordml/sdtdatahash" xmlns:w16sdtfl="http://schemas.microsoft.com/office/word/2024/wordml/sdtformatlock" xmlns:w16se="http://schemas.microsoft.com/office/word/2015/wordml/symex" xmlns:wpg="http://schemas.microsoft.com/office/word/2010/wordprocessingGroup" xmlns:wpi="http://schemas.microsoft.com/office/word/2010/wordprocessingInk" xmlns:wne="http://schemas.microsoft.com/office/word/2006/wordml" xmlns:wps="http://schemas.microsoft.com/office/word/2010/wordprocessingShape" mc:Ignorable="w14 w15 w16se w16cid w16 w16cex w16sdtdh w16sdtfl w16du wp14">
   <w:p>
     <w:pPr>
       <w:pStyle w:val="Title"/>
@@ -1617,28 +1444,14 @@
       <w:rPr>
         <w:lang w:val="en-US"/>
       </w:rPr>
-      <w:t xml:space="preserve">Chee-Wee </w:t>
-    </w:r>
-    <w:proofErr w:type="gramStart"/>
-    <w:r>
-      <w:rPr>
-        <w:lang w:val="en-US"/>
-      </w:rPr>
-      <w:t>Chua’s  Portfolio</w:t>
-    </w:r>
-    <w:proofErr w:type="gramEnd"/>
-    <w:r>
-      <w:rPr>
-        <w:lang w:val="en-US"/>
-      </w:rPr>
-      <w:t xml:space="preserve"> of Projects</w:t>
+      <w:t>Chee-Wee Chua’s  Portfolio of Projects</w:t>
     </w:r>
   </w:p>
 </w:hdr>
 </file>
 
 <file path=word/numbering.xml><?xml version="1.0" encoding="utf-8"?>
-<w:numbering xmlns:wpc="http://schemas.microsoft.com/office/word/2010/wordprocessingCanvas" xmlns:mc="http://schemas.openxmlformats.org/markup-compatibility/2006" xmlns:o="urn:schemas-microsoft-com:office:office" xmlns:r="http://schemas.openxmlformats.org/officeDocument/2006/relationships" xmlns:m="http://schemas.openxmlformats.org/officeDocument/2006/math" xmlns:v="urn:schemas-microsoft-com:vml" xmlns:wp14="http://schemas.microsoft.com/office/word/2010/wordprocessingDrawing" xmlns:wp="http://schemas.openxmlformats.org/drawingml/2006/wordprocessingDrawing" xmlns:w10="urn:schemas-microsoft-com:office:word" xmlns:w="http://schemas.openxmlformats.org/wordprocessingml/2006/main" xmlns:w14="http://schemas.microsoft.com/office/word/2010/wordml" xmlns:w15="http://schemas.microsoft.com/office/word/2012/wordml" xmlns:wpg="http://schemas.microsoft.com/office/word/2010/wordprocessingGroup" xmlns:wpi="http://schemas.microsoft.com/office/word/2010/wordprocessingInk" xmlns:wne="http://schemas.microsoft.com/office/word/2006/wordml" xmlns:wps="http://schemas.microsoft.com/office/word/2010/wordprocessingShape" mc:Ignorable="w14 w15 wp14">
+<w:numbering xmlns:wpc="http://schemas.microsoft.com/office/word/2010/wordprocessingCanvas" xmlns:cx="http://schemas.microsoft.com/office/drawing/2014/chartex" xmlns:cx1="http://schemas.microsoft.com/office/drawing/2015/9/8/chartex" xmlns:cx2="http://schemas.microsoft.com/office/drawing/2015/10/21/chartex" xmlns:cx3="http://schemas.microsoft.com/office/drawing/2016/5/9/chartex" xmlns:cx4="http://schemas.microsoft.com/office/drawing/2016/5/10/chartex" xmlns:cx5="http://schemas.microsoft.com/office/drawing/2016/5/11/chartex" xmlns:cx6="http://schemas.microsoft.com/office/drawing/2016/5/12/chartex" xmlns:cx7="http://schemas.microsoft.com/office/drawing/2016/5/13/chartex" xmlns:cx8="http://schemas.microsoft.com/office/drawing/2016/5/14/chartex" xmlns:mc="http://schemas.openxmlformats.org/markup-compatibility/2006" xmlns:aink="http://schemas.microsoft.com/office/drawing/2016/ink" xmlns:am3d="http://schemas.microsoft.com/office/drawing/2017/model3d" xmlns:o="urn:schemas-microsoft-com:office:office" xmlns:oel="http://schemas.microsoft.com/office/2019/extlst" xmlns:r="http://schemas.openxmlformats.org/officeDocument/2006/relationships" xmlns:m="http://schemas.openxmlformats.org/officeDocument/2006/math" xmlns:v="urn:schemas-microsoft-com:vml" xmlns:wp14="http://schemas.microsoft.com/office/word/2010/wordprocessingDrawing" xmlns:wp="http://schemas.openxmlformats.org/drawingml/2006/wordprocessingDrawing" xmlns:w10="urn:schemas-microsoft-com:office:word" xmlns:w="http://schemas.openxmlformats.org/wordprocessingml/2006/main" xmlns:w14="http://schemas.microsoft.com/office/word/2010/wordml" xmlns:w15="http://schemas.microsoft.com/office/word/2012/wordml" xmlns:w16cex="http://schemas.microsoft.com/office/word/2018/wordml/cex" xmlns:w16cid="http://schemas.microsoft.com/office/word/2016/wordml/cid" xmlns:w16="http://schemas.microsoft.com/office/word/2018/wordml" xmlns:w16du="http://schemas.microsoft.com/office/word/2023/wordml/word16du" xmlns:w16sdtdh="http://schemas.microsoft.com/office/word/2020/wordml/sdtdatahash" xmlns:w16sdtfl="http://schemas.microsoft.com/office/word/2024/wordml/sdtformatlock" xmlns:w16se="http://schemas.microsoft.com/office/word/2015/wordml/symex" xmlns:wpg="http://schemas.microsoft.com/office/word/2010/wordprocessingGroup" xmlns:wpi="http://schemas.microsoft.com/office/word/2010/wordprocessingInk" xmlns:wne="http://schemas.microsoft.com/office/word/2006/wordml" xmlns:wps="http://schemas.microsoft.com/office/word/2010/wordprocessingShape" mc:Ignorable="w14 w15 w16se w16cid w16 w16cex w16sdtdh w16sdtfl w16du wp14">
   <w:abstractNum w:abstractNumId="0" w15:restartNumberingAfterBreak="0">
     <w:nsid w:val="04E16A50"/>
     <w:multiLevelType w:val="multilevel"/>
@@ -2091,23 +1904,23 @@
       </w:pPr>
     </w:lvl>
   </w:abstractNum>
-  <w:num w:numId="1">
+  <w:num w:numId="1" w16cid:durableId="2120248376">
     <w:abstractNumId w:val="1"/>
   </w:num>
-  <w:num w:numId="2">
+  <w:num w:numId="2" w16cid:durableId="195391699">
     <w:abstractNumId w:val="3"/>
   </w:num>
-  <w:num w:numId="3">
+  <w:num w:numId="3" w16cid:durableId="678509012">
     <w:abstractNumId w:val="0"/>
   </w:num>
-  <w:num w:numId="4">
+  <w:num w:numId="4" w16cid:durableId="143356687">
     <w:abstractNumId w:val="2"/>
   </w:num>
 </w:numbering>
 </file>
 
 <file path=word/styles.xml><?xml version="1.0" encoding="utf-8"?>
-<w:styles xmlns:mc="http://schemas.openxmlformats.org/markup-compatibility/2006" xmlns:r="http://schemas.openxmlformats.org/officeDocument/2006/relationships" xmlns:w="http://schemas.openxmlformats.org/wordprocessingml/2006/main" xmlns:w14="http://schemas.microsoft.com/office/word/2010/wordml" xmlns:w15="http://schemas.microsoft.com/office/word/2012/wordml" mc:Ignorable="w14 w15">
+<w:styles xmlns:mc="http://schemas.openxmlformats.org/markup-compatibility/2006" xmlns:r="http://schemas.openxmlformats.org/officeDocument/2006/relationships" xmlns:w="http://schemas.openxmlformats.org/wordprocessingml/2006/main" xmlns:w14="http://schemas.microsoft.com/office/word/2010/wordml" xmlns:w15="http://schemas.microsoft.com/office/word/2012/wordml" xmlns:w16cex="http://schemas.microsoft.com/office/word/2018/wordml/cex" xmlns:w16cid="http://schemas.microsoft.com/office/word/2016/wordml/cid" xmlns:w16="http://schemas.microsoft.com/office/word/2018/wordml" xmlns:w16du="http://schemas.microsoft.com/office/word/2023/wordml/word16du" xmlns:w16sdtdh="http://schemas.microsoft.com/office/word/2020/wordml/sdtdatahash" xmlns:w16sdtfl="http://schemas.microsoft.com/office/word/2024/wordml/sdtformatlock" xmlns:w16se="http://schemas.microsoft.com/office/word/2015/wordml/symex" mc:Ignorable="w14 w15 w16se w16cid w16 w16cex w16sdtdh w16sdtfl w16du">
   <w:docDefaults>
     <w:rPrDefault>
       <w:rPr>
@@ -2125,7 +1938,7 @@
       </w:pPr>
     </w:pPrDefault>
   </w:docDefaults>
-  <w:latentStyles w:defLockedState="0" w:defUIPriority="99" w:defSemiHidden="0" w:defUnhideWhenUsed="0" w:defQFormat="0" w:count="371">
+  <w:latentStyles w:defLockedState="0" w:defUIPriority="99" w:defSemiHidden="0" w:defUnhideWhenUsed="0" w:defQFormat="0" w:count="376">
     <w:lsdException w:name="Normal" w:uiPriority="0" w:qFormat="1"/>
     <w:lsdException w:name="heading 1" w:uiPriority="9" w:qFormat="1"/>
     <w:lsdException w:name="heading 2" w:semiHidden="1" w:uiPriority="9" w:unhideWhenUsed="1" w:qFormat="1"/>
@@ -2497,6 +2310,11 @@
     <w:lsdException w:name="List Table 5 Dark Accent 6" w:uiPriority="50"/>
     <w:lsdException w:name="List Table 6 Colorful Accent 6" w:uiPriority="51"/>
     <w:lsdException w:name="List Table 7 Colorful Accent 6" w:uiPriority="52"/>
+    <w:lsdException w:name="Mention" w:semiHidden="1" w:unhideWhenUsed="1"/>
+    <w:lsdException w:name="Smart Hyperlink" w:semiHidden="1" w:unhideWhenUsed="1"/>
+    <w:lsdException w:name="Hashtag" w:semiHidden="1" w:unhideWhenUsed="1"/>
+    <w:lsdException w:name="Unresolved Mention" w:semiHidden="1" w:unhideWhenUsed="1"/>
+    <w:lsdException w:name="Smart Link" w:semiHidden="1" w:unhideWhenUsed="1"/>
   </w:latentStyles>
   <w:style w:type="paragraph" w:default="1" w:styleId="Normal">
     <w:name w:val="Normal"/>
@@ -2574,8 +2392,8 @@
       <w:u w:val="single"/>
     </w:rPr>
   </w:style>
-  <w:style w:type="character" w:customStyle="1" w:styleId="UnresolvedMention">
-    <w:name w:val="Unresolved Mention"/>
+  <w:style w:type="character" w:customStyle="1" w:styleId="UnresolvedMention1">
+    <w:name w:val="Unresolved Mention1"/>
     <w:basedOn w:val="DefaultParagraphFont"/>
     <w:uiPriority w:val="99"/>
     <w:semiHidden/>
@@ -2691,6 +2509,18 @@
       <w:kern w:val="0"/>
       <w:lang w:val="en-US"/>
       <w14:ligatures w14:val="none"/>
+    </w:rPr>
+  </w:style>
+  <w:style w:type="character" w:styleId="UnresolvedMention">
+    <w:name w:val="Unresolved Mention"/>
+    <w:basedOn w:val="DefaultParagraphFont"/>
+    <w:uiPriority w:val="99"/>
+    <w:semiHidden/>
+    <w:unhideWhenUsed/>
+    <w:rsid w:val="007827D3"/>
+    <w:rPr>
+      <w:color w:val="605E5C"/>
+      <w:shd w:val="clear" w:color="auto" w:fill="E1DFDD"/>
     </w:rPr>
   </w:style>
 </w:styles>

</xml_diff>